<commit_message>
feat: implement SIASN export and adjust reset button layout
</commit_message>
<xml_diff>
--- a/public/templates/template_anjab.docx
+++ b/public/templates/template_anjab.docx
@@ -643,6 +643,7 @@
         <w:gridCol w:w="100"/>
         <w:gridCol w:w="100"/>
         <w:gridCol w:w="100"/>
+        <w:gridCol w:w="100"/>
       </w:tblGrid>
       <w:tr>
         <w:tc>
@@ -789,6 +790,30 @@
             </w:r>
           </w:p>
         </w:tc>
+        <w:tc>
+          <w:tcPr>
+            <w:tcW w:type="pct" w:w="12%"/>
+            <w:gridSpan w:val="1"/>
+            <w:tcMar>
+              <w:top w:type="dxa" w:w="100"/>
+              <w:left w:type="dxa" w:w="100"/>
+              <w:bottom w:type="dxa" w:w="100"/>
+              <w:right w:type="dxa" w:w="100"/>
+            </w:tcMar>
+          </w:tcPr>
+          <w:p>
+            <w:r>
+              <w:rPr>
+                <w:rFonts w:ascii="Arial" w:cs="Arial" w:eastAsia="Arial" w:hAnsi="Arial"/>
+                <w:b/>
+                <w:bCs/>
+                <w:sz w:val="20"/>
+                <w:szCs w:val="20"/>
+              </w:rPr>
+              <w:t xml:space="preserve">Kebutuhan Pegawai</w:t>
+            </w:r>
+          </w:p>
+        </w:tc>
       </w:tr>
       <w:tr>
         <w:tc>
@@ -925,7 +950,164 @@
                 <w:sz w:val="20"/>
                 <w:szCs w:val="20"/>
               </w:rPr>
-              <w:t xml:space="preserve">{waktuEfektif}{/tugasPokok}</w:t>
+              <w:t xml:space="preserve">{waktuEfektif}</w:t>
+            </w:r>
+          </w:p>
+        </w:tc>
+        <w:tc>
+          <w:tcPr>
+            <w:gridSpan w:val="1"/>
+            <w:tcMar>
+              <w:top w:type="dxa" w:w="100"/>
+              <w:left w:type="dxa" w:w="100"/>
+              <w:bottom w:type="dxa" w:w="100"/>
+              <w:right w:type="dxa" w:w="100"/>
+            </w:tcMar>
+          </w:tcPr>
+          <w:p>
+            <w:r>
+              <w:rPr>
+                <w:rFonts w:ascii="Arial" w:cs="Arial" w:eastAsia="Arial" w:hAnsi="Arial"/>
+                <w:b w:val="false"/>
+                <w:bCs w:val="false"/>
+                <w:sz w:val="20"/>
+                <w:szCs w:val="20"/>
+              </w:rPr>
+              <w:t xml:space="preserve">{kebutuhanPegawai}{/tugasPokok}</w:t>
+            </w:r>
+          </w:p>
+        </w:tc>
+      </w:tr>
+      <w:tr>
+        <w:tc>
+          <w:tcPr>
+            <w:gridSpan w:val="5"/>
+            <w:tcMar>
+              <w:top w:type="dxa" w:w="100"/>
+              <w:left w:type="dxa" w:w="100"/>
+              <w:bottom w:type="dxa" w:w="100"/>
+              <w:right w:type="dxa" w:w="100"/>
+            </w:tcMar>
+          </w:tcPr>
+          <w:p>
+            <w:pPr>
+              <w:jc w:val="center"/>
+            </w:pPr>
+            <w:r>
+              <w:rPr>
+                <w:rFonts w:ascii="Arial" w:cs="Arial" w:eastAsia="Arial" w:hAnsi="Arial"/>
+                <w:b/>
+                <w:bCs/>
+                <w:sz w:val="20"/>
+                <w:szCs w:val="20"/>
+              </w:rPr>
+              <w:t xml:space="preserve">JUMLAH</w:t>
+            </w:r>
+          </w:p>
+        </w:tc>
+        <w:tc>
+          <w:tcPr>
+            <w:gridSpan w:val="1"/>
+            <w:tcMar>
+              <w:top w:type="dxa" w:w="100"/>
+              <w:left w:type="dxa" w:w="100"/>
+              <w:bottom w:type="dxa" w:w="100"/>
+              <w:right w:type="dxa" w:w="100"/>
+            </w:tcMar>
+          </w:tcPr>
+          <w:p>
+            <w:pPr>
+              <w:jc w:val="center"/>
+            </w:pPr>
+            <w:r>
+              <w:rPr>
+                <w:rFonts w:ascii="Arial" w:cs="Arial" w:eastAsia="Arial" w:hAnsi="Arial"/>
+                <w:b/>
+                <w:bCs/>
+                <w:sz w:val="20"/>
+                <w:szCs w:val="20"/>
+              </w:rPr>
+              <w:t xml:space="preserve">{totalWaktuEfektif}</w:t>
+            </w:r>
+          </w:p>
+        </w:tc>
+        <w:tc>
+          <w:tcPr>
+            <w:gridSpan w:val="1"/>
+            <w:tcMar>
+              <w:top w:type="dxa" w:w="100"/>
+              <w:left w:type="dxa" w:w="100"/>
+              <w:bottom w:type="dxa" w:w="100"/>
+              <w:right w:type="dxa" w:w="100"/>
+            </w:tcMar>
+          </w:tcPr>
+          <w:p>
+            <w:pPr>
+              <w:jc w:val="center"/>
+            </w:pPr>
+            <w:r>
+              <w:rPr>
+                <w:rFonts w:ascii="Arial" w:cs="Arial" w:eastAsia="Arial" w:hAnsi="Arial"/>
+                <w:b/>
+                <w:bCs/>
+                <w:sz w:val="20"/>
+                <w:szCs w:val="20"/>
+              </w:rPr>
+              <w:t xml:space="preserve">{totalKebutuhanPegawai}</w:t>
+            </w:r>
+          </w:p>
+        </w:tc>
+      </w:tr>
+      <w:tr>
+        <w:tc>
+          <w:tcPr>
+            <w:gridSpan w:val="6"/>
+            <w:tcMar>
+              <w:top w:type="dxa" w:w="100"/>
+              <w:left w:type="dxa" w:w="100"/>
+              <w:bottom w:type="dxa" w:w="100"/>
+              <w:right w:type="dxa" w:w="100"/>
+            </w:tcMar>
+          </w:tcPr>
+          <w:p>
+            <w:pPr>
+              <w:jc w:val="center"/>
+            </w:pPr>
+            <w:r>
+              <w:rPr>
+                <w:rFonts w:ascii="Arial" w:cs="Arial" w:eastAsia="Arial" w:hAnsi="Arial"/>
+                <w:b/>
+                <w:bCs/>
+                <w:sz w:val="20"/>
+                <w:szCs w:val="20"/>
+              </w:rPr>
+              <w:t xml:space="preserve">JUMLAH PEGAWAI</w:t>
+            </w:r>
+          </w:p>
+        </w:tc>
+        <w:tc>
+          <w:tcPr>
+            <w:gridSpan w:val="1"/>
+            <w:tcMar>
+              <w:top w:type="dxa" w:w="100"/>
+              <w:left w:type="dxa" w:w="100"/>
+              <w:bottom w:type="dxa" w:w="100"/>
+              <w:right w:type="dxa" w:w="100"/>
+            </w:tcMar>
+          </w:tcPr>
+          <w:p>
+            <w:pPr>
+              <w:jc w:val="center"/>
+            </w:pPr>
+            <w:r>
+              <w:rPr>
+                <w:rFonts w:ascii="Arial" w:cs="Arial" w:eastAsia="Arial" w:hAnsi="Arial"/>
+                <w:b/>
+                <w:bCs/>
+                <w:sz w:val="20"/>
+                <w:szCs w:val="20"/>
+              </w:rPr>
+              <w:t xml:space="preserve">{jumlahPegawaiOrang}</w:t>
             </w:r>
           </w:p>
         </w:tc>

</xml_diff>